<commit_message>
IC: RTL simulation passes bit-exact; update docs
Icarus Verilog 14 runs the testbench PASS 16000/16000 against the Python
fixed-point model, 20 clock cycles per sample, no warnings with -Wall.
Config B also passes 16000/16000. A deliberately corrupted golden vector
is reported as FAIL 1/16000, so the checker is not vacuous.

README, the design-flow figure and the team explainer (.docx/.pdf) now
show step 4 (simulation) as done.

Co-Authored-By: Claude Opus 5.5 <noreply@anthropic.com>
</commit_message>
<xml_diff>
--- a/ic/doc/FPOLY_UAV_chip_PID_giai_thich.docx
+++ b/ic/doc/FPOLY_UAV_chip_PID_giai_thich.docx
@@ -37,7 +37,7 @@
         <w:t xml:space="preserve">Đọc nhanh:</w:t>
       </w:r>
       <w:r>
-        <w:t xml:space="preserve"> nhóm đã có drone bay được với thuật toán PID chạy trên STM32. Tài liệu này giải thích cách biến thuật toán đó thành một con chip riêng: đã làm được gì (mô hình số nguyên, mạch Verilog, bộ kiểm thử), vì sao chọn như vậy, và còn phải làm gì tiếp. Mục 8 có bảng giải nghĩa các thuật ngữ.</w:t>
+        <w:t xml:space="preserve"> nhóm đã có drone bay được với thuật toán PID chạy trên STM32. Tài liệu này giải thích cách biến thuật toán đó thành một con chip riêng: đã làm được gì (mô hình số nguyên, mạch Verilog, bộ kiểm thử đã PASS), vì sao chọn như vậy, và còn phải làm gì tiếp. Mục 8 có bảng giải nghĩa các thuật ngữ.</w:t>
       </w:r>
     </w:p>
     <w:p>
@@ -154,7 +154,7 @@
         <w:pStyle w:val="Caption"/>
       </w:pPr>
       <w:r>
-        <w:t xml:space="preserve">Hình 1. Bảy bước làm một con chip. Ba bước đầu đã xong trên máy của nhóm; bốn bước sau cần công cụ Cadence.</w:t>
+        <w:t xml:space="preserve">Hình 1. Bảy bước làm một con chip. Bốn bước đầu đã xong trên máy của nhóm; ba bước sau cần công cụ Cadence.</w:t>
       </w:r>
     </w:p>
     <w:tbl>
@@ -177,10 +177,10 @@
         </w:tblCellMar>
       </w:tblPr>
       <w:tblGrid>
-        <w:gridCol w:w="1981"/>
-        <w:gridCol w:w="3783"/>
-        <w:gridCol w:w="1531"/>
-        <w:gridCol w:w="2343"/>
+        <w:gridCol w:w="1927"/>
+        <w:gridCol w:w="3679"/>
+        <w:gridCol w:w="1489"/>
+        <w:gridCol w:w="2543"/>
       </w:tblGrid>
       <w:tr>
         <w:trPr>
@@ -189,7 +189,7 @@
         </w:trPr>
         <w:tc>
           <w:tcPr>
-            <w:tcW w:w="1981" w:type="dxa"/>
+            <w:tcW w:w="1927" w:type="dxa"/>
             <w:shd w:val="clear" w:color="auto" w:fill="E7F5FF"/>
           </w:tcPr>
           <w:p>
@@ -206,7 +206,7 @@
         </w:tc>
         <w:tc>
           <w:tcPr>
-            <w:tcW w:w="3783" w:type="dxa"/>
+            <w:tcW w:w="3679" w:type="dxa"/>
             <w:shd w:val="clear" w:color="auto" w:fill="E7F5FF"/>
           </w:tcPr>
           <w:p>
@@ -223,7 +223,7 @@
         </w:tc>
         <w:tc>
           <w:tcPr>
-            <w:tcW w:w="1531" w:type="dxa"/>
+            <w:tcW w:w="1489" w:type="dxa"/>
             <w:shd w:val="clear" w:color="auto" w:fill="E7F5FF"/>
           </w:tcPr>
           <w:p>
@@ -240,7 +240,7 @@
         </w:tc>
         <w:tc>
           <w:tcPr>
-            <w:tcW w:w="2343" w:type="dxa"/>
+            <w:tcW w:w="2543" w:type="dxa"/>
             <w:shd w:val="clear" w:color="auto" w:fill="E7F5FF"/>
           </w:tcPr>
           <w:p>
@@ -262,7 +262,7 @@
         </w:trPr>
         <w:tc>
           <w:tcPr>
-            <w:tcW w:w="1981" w:type="dxa"/>
+            <w:tcW w:w="1927" w:type="dxa"/>
           </w:tcPr>
           <w:p>
             <w:pPr>
@@ -275,7 +275,7 @@
         </w:tc>
         <w:tc>
           <w:tcPr>
-            <w:tcW w:w="3783" w:type="dxa"/>
+            <w:tcW w:w="3679" w:type="dxa"/>
           </w:tcPr>
           <w:p>
             <w:pPr>
@@ -288,7 +288,7 @@
         </w:tc>
         <w:tc>
           <w:tcPr>
-            <w:tcW w:w="1531" w:type="dxa"/>
+            <w:tcW w:w="1489" w:type="dxa"/>
           </w:tcPr>
           <w:p>
             <w:pPr>
@@ -308,7 +308,7 @@
         </w:tc>
         <w:tc>
           <w:tcPr>
-            <w:tcW w:w="2343" w:type="dxa"/>
+            <w:tcW w:w="2543" w:type="dxa"/>
           </w:tcPr>
           <w:p>
             <w:pPr>
@@ -326,7 +326,7 @@
         </w:trPr>
         <w:tc>
           <w:tcPr>
-            <w:tcW w:w="1981" w:type="dxa"/>
+            <w:tcW w:w="1927" w:type="dxa"/>
           </w:tcPr>
           <w:p>
             <w:pPr>
@@ -339,7 +339,7 @@
         </w:tc>
         <w:tc>
           <w:tcPr>
-            <w:tcW w:w="3783" w:type="dxa"/>
+            <w:tcW w:w="3679" w:type="dxa"/>
           </w:tcPr>
           <w:p>
             <w:pPr>
@@ -352,7 +352,7 @@
         </w:tc>
         <w:tc>
           <w:tcPr>
-            <w:tcW w:w="1531" w:type="dxa"/>
+            <w:tcW w:w="1489" w:type="dxa"/>
           </w:tcPr>
           <w:p>
             <w:pPr>
@@ -365,7 +365,7 @@
         </w:tc>
         <w:tc>
           <w:tcPr>
-            <w:tcW w:w="2343" w:type="dxa"/>
+            <w:tcW w:w="2543" w:type="dxa"/>
           </w:tcPr>
           <w:p>
             <w:pPr>
@@ -383,7 +383,7 @@
         </w:trPr>
         <w:tc>
           <w:tcPr>
-            <w:tcW w:w="1981" w:type="dxa"/>
+            <w:tcW w:w="1927" w:type="dxa"/>
           </w:tcPr>
           <w:p>
             <w:pPr>
@@ -396,7 +396,7 @@
         </w:tc>
         <w:tc>
           <w:tcPr>
-            <w:tcW w:w="3783" w:type="dxa"/>
+            <w:tcW w:w="3679" w:type="dxa"/>
           </w:tcPr>
           <w:p>
             <w:pPr>
@@ -409,7 +409,7 @@
         </w:tc>
         <w:tc>
           <w:tcPr>
-            <w:tcW w:w="1531" w:type="dxa"/>
+            <w:tcW w:w="1489" w:type="dxa"/>
           </w:tcPr>
           <w:p>
             <w:pPr>
@@ -422,7 +422,7 @@
         </w:tc>
         <w:tc>
           <w:tcPr>
-            <w:tcW w:w="2343" w:type="dxa"/>
+            <w:tcW w:w="2543" w:type="dxa"/>
           </w:tcPr>
           <w:p>
             <w:pPr>
@@ -440,7 +440,7 @@
         </w:trPr>
         <w:tc>
           <w:tcPr>
-            <w:tcW w:w="1981" w:type="dxa"/>
+            <w:tcW w:w="1927" w:type="dxa"/>
           </w:tcPr>
           <w:p>
             <w:pPr>
@@ -453,7 +453,7 @@
         </w:tc>
         <w:tc>
           <w:tcPr>
-            <w:tcW w:w="3783" w:type="dxa"/>
+            <w:tcW w:w="3679" w:type="dxa"/>
           </w:tcPr>
           <w:p>
             <w:pPr>
@@ -466,38 +466,38 @@
         </w:tc>
         <w:tc>
           <w:tcPr>
-            <w:tcW w:w="1531" w:type="dxa"/>
-          </w:tcPr>
-          <w:p>
-            <w:pPr>
-              <w:pStyle w:val="TableText"/>
-            </w:pPr>
-            <w:r>
-              <w:t xml:space="preserve">Icarus / Xcelium</w:t>
-            </w:r>
-          </w:p>
-        </w:tc>
-        <w:tc>
-          <w:tcPr>
-            <w:tcW w:w="2343" w:type="dxa"/>
-          </w:tcPr>
-          <w:p>
-            <w:pPr>
-              <w:pStyle w:val="TableText"/>
-            </w:pPr>
-            <w:r>
-              <w:t xml:space="preserve">Chưa chạy (thiếu phần mềm)</w:t>
-            </w:r>
-          </w:p>
-        </w:tc>
-      </w:tr>
-      <w:tr>
-        <w:trPr>
-          <w:cantSplit/>
-        </w:trPr>
-        <w:tc>
-          <w:tcPr>
-            <w:tcW w:w="1981" w:type="dxa"/>
+            <w:tcW w:w="1489" w:type="dxa"/>
+          </w:tcPr>
+          <w:p>
+            <w:pPr>
+              <w:pStyle w:val="TableText"/>
+            </w:pPr>
+            <w:r>
+              <w:t xml:space="preserve">Icarus Verilog</w:t>
+            </w:r>
+          </w:p>
+        </w:tc>
+        <w:tc>
+          <w:tcPr>
+            <w:tcW w:w="2543" w:type="dxa"/>
+          </w:tcPr>
+          <w:p>
+            <w:pPr>
+              <w:pStyle w:val="TableText"/>
+            </w:pPr>
+            <w:r>
+              <w:t xml:space="preserve">Xong — PASS 16.000/16.000 mẫu</w:t>
+            </w:r>
+          </w:p>
+        </w:tc>
+      </w:tr>
+      <w:tr>
+        <w:trPr>
+          <w:cantSplit/>
+        </w:trPr>
+        <w:tc>
+          <w:tcPr>
+            <w:tcW w:w="1927" w:type="dxa"/>
           </w:tcPr>
           <w:p>
             <w:pPr>
@@ -510,7 +510,7 @@
         </w:tc>
         <w:tc>
           <w:tcPr>
-            <w:tcW w:w="3783" w:type="dxa"/>
+            <w:tcW w:w="3679" w:type="dxa"/>
           </w:tcPr>
           <w:p>
             <w:pPr>
@@ -523,7 +523,7 @@
         </w:tc>
         <w:tc>
           <w:tcPr>
-            <w:tcW w:w="1531" w:type="dxa"/>
+            <w:tcW w:w="1489" w:type="dxa"/>
           </w:tcPr>
           <w:p>
             <w:pPr>
@@ -536,7 +536,7 @@
         </w:tc>
         <w:tc>
           <w:tcPr>
-            <w:tcW w:w="2343" w:type="dxa"/>
+            <w:tcW w:w="2543" w:type="dxa"/>
           </w:tcPr>
           <w:p>
             <w:pPr>
@@ -554,7 +554,7 @@
         </w:trPr>
         <w:tc>
           <w:tcPr>
-            <w:tcW w:w="1981" w:type="dxa"/>
+            <w:tcW w:w="1927" w:type="dxa"/>
           </w:tcPr>
           <w:p>
             <w:pPr>
@@ -567,7 +567,7 @@
         </w:tc>
         <w:tc>
           <w:tcPr>
-            <w:tcW w:w="3783" w:type="dxa"/>
+            <w:tcW w:w="3679" w:type="dxa"/>
           </w:tcPr>
           <w:p>
             <w:pPr>
@@ -580,7 +580,7 @@
         </w:tc>
         <w:tc>
           <w:tcPr>
-            <w:tcW w:w="1531" w:type="dxa"/>
+            <w:tcW w:w="1489" w:type="dxa"/>
           </w:tcPr>
           <w:p>
             <w:pPr>
@@ -593,7 +593,7 @@
         </w:tc>
         <w:tc>
           <w:tcPr>
-            <w:tcW w:w="2343" w:type="dxa"/>
+            <w:tcW w:w="2543" w:type="dxa"/>
           </w:tcPr>
           <w:p>
             <w:pPr>
@@ -611,7 +611,7 @@
         </w:trPr>
         <w:tc>
           <w:tcPr>
-            <w:tcW w:w="1981" w:type="dxa"/>
+            <w:tcW w:w="1927" w:type="dxa"/>
           </w:tcPr>
           <w:p>
             <w:pPr>
@@ -624,7 +624,7 @@
         </w:tc>
         <w:tc>
           <w:tcPr>
-            <w:tcW w:w="3783" w:type="dxa"/>
+            <w:tcW w:w="3679" w:type="dxa"/>
           </w:tcPr>
           <w:p>
             <w:pPr>
@@ -637,7 +637,7 @@
         </w:tc>
         <w:tc>
           <w:tcPr>
-            <w:tcW w:w="1531" w:type="dxa"/>
+            <w:tcW w:w="1489" w:type="dxa"/>
           </w:tcPr>
           <w:p>
             <w:pPr>
@@ -650,7 +650,7 @@
         </w:tc>
         <w:tc>
           <w:tcPr>
-            <w:tcW w:w="2343" w:type="dxa"/>
+            <w:tcW w:w="2543" w:type="dxa"/>
           </w:tcPr>
           <w:p>
             <w:pPr>
@@ -3119,35 +3119,45 @@
     </w:p>
     <w:p>
       <w:pPr>
-        <w:pStyle w:val="Note"/>
+        <w:pStyle w:val="Ok"/>
       </w:pPr>
       <w:r>
         <w:rPr>
           <w:b/>
         </w:rPr>
-        <w:t xml:space="preserve">Trạng thái:</w:t>
-      </w:r>
-      <w:r>
-        <w:t xml:space="preserve"> mạch và testbench đã biên dịch qua ModelSim ở chế độ kiểm tra chặt (</w:t>
+        <w:t xml:space="preserve">Kết quả:</w:t>
+      </w:r>
+      <w:r>
+        <w:t xml:space="preserve"> mô phỏng bằng Icarus Verilog 14 cho </w:t>
+      </w:r>
+      <w:r>
+        <w:rPr>
+          <w:b/>
+        </w:rPr>
+        <w:t xml:space="preserve">PASS 16.000/16.000 mẫu</w:t>
+      </w:r>
+      <w:r>
+        <w:t xml:space="preserve"> — mạch khớp từng bit với mô hình Python, mỗi mẫu tính xong trong đúng 20 chu kỳ clock, biên dịch với </w:t>
       </w:r>
       <w:r>
         <w:rPr>
           <w:rFonts w:ascii="Consolas" w:hAnsi="Consolas" w:cs="Consolas"/>
           <w:shd w:val="clear" w:color="auto" w:fill="F1F3F5"/>
         </w:rPr>
-        <w:t xml:space="preserve">vlog -lint</w:t>
-      </w:r>
-      <w:r>
-        <w:t xml:space="preserve">): 0 lỗi, 0 cảnh báo. </w:t>
+        <w:t xml:space="preserve">-Wall</w:t>
+      </w:r>
+      <w:r>
+        <w:t xml:space="preserve"> không có cảnh báo nào. Cả cấu hình A và B đều PASS. Để chắc testbench thật sự bắt được lỗi, nhóm đã thử sửa sai 1 đáp án trong bộ đề: testbench báo đúng </w:t>
       </w:r>
       <w:r>
         <w:rPr>
-          <w:b/>
+          <w:rFonts w:ascii="Consolas" w:hAnsi="Consolas" w:cs="Consolas"/>
+          <w:shd w:val="clear" w:color="auto" w:fill="F1F3F5"/>
         </w:rPr>
-        <w:t xml:space="preserve">Chưa chạy mô phỏng</w:t>
-      </w:r>
-      <w:r>
-        <w:t xml:space="preserve"> vì ModelSim trên máy không có license. Cần cài Icarus Verilog (miễn phí) hoặc dùng Cadence Xcelium, rồi chạy </w:t>
+        <w:t xml:space="preserve">FAIL: 1/16000</w:t>
+      </w:r>
+      <w:r>
+        <w:t xml:space="preserve"> và chỉ ra mẫu bị sai. Chạy lại bằng lệnh </w:t>
       </w:r>
       <w:r>
         <w:rPr>
@@ -3157,7 +3167,7 @@
         <w:t xml:space="preserve">sh ic/sim/run_iverilog.sh</w:t>
       </w:r>
       <w:r>
-        <w:t xml:space="preserve"> để có kết quả PASS/FAIL.</w:t>
+        <w:t xml:space="preserve">.</w:t>
       </w:r>
     </w:p>
     <w:p>
@@ -3656,7 +3666,7 @@
               <w:pStyle w:val="TableText"/>
             </w:pPr>
             <w:r>
-              <w:t xml:space="preserve">Cài Icarus Verilog, chạy mô phỏng</w:t>
+              <w:t xml:space="preserve">Mô phỏng RTL</w:t>
             </w:r>
           </w:p>
         </w:tc>
@@ -3669,7 +3679,7 @@
               <w:pStyle w:val="TableText"/>
             </w:pPr>
             <w:r>
-              <w:t xml:space="preserve">Có PASS mới chắc chắn mạch đúng</w:t>
+              <w:t xml:space="preserve">Đã xong: PASS 16.000/16.000 (Icarus Verilog)</w:t>
             </w:r>
           </w:p>
         </w:tc>
@@ -3943,7 +3953,7 @@
               <w:pStyle w:val="TableText"/>
             </w:pPr>
             <w:r>
-              <w:t xml:space="preserve">Hỏi thẳng vào bước 5–7 (Genus, Innovus, kiểm tra cuối)</w:t>
+              <w:t xml:space="preserve">Chạy lại mô phỏng bằng Xcelium, rồi hỏi thẳng vào bước 5–7 (Genus, Innovus, kiểm tra cuối)</w:t>
             </w:r>
           </w:p>
         </w:tc>

</xml_diff>